<commit_message>
Update handover document with GitHub repo URL and clone instructions
https://claude.ai/code/session_01TrNVvaScyZ6xAii2RnxxBM
</commit_message>
<xml_diff>
--- a/database/交接文件_BudgetAgent_v2.docx
+++ b/database/交接文件_BudgetAgent_v2.docx
@@ -2425,7 +2425,125 @@
           <w:color w:val="34495E"/>
           <w:sz w:val="24"/>
         </w:rPr>
-        <w:t>6.4 拉取最新代碼（Windows PC）</w:t>
+        <w:t>6.4 GitHub 儲存庫資訊</w:t>
+      </w:r>
+    </w:p>
+    <w:p>
+      <w:r>
+        <w:rPr>
+          <w:rFonts w:ascii="Microsoft JhengHei" w:hAnsi="Microsoft JhengHei" w:eastAsia="Microsoft JhengHei"/>
+          <w:b/>
+          <w:sz w:val="21"/>
+        </w:rPr>
+        <w:t>Repository（GitHub）：</w:t>
+      </w:r>
+    </w:p>
+    <w:p>
+      <w:pPr>
+        <w:ind w:left="576"/>
+        <w:shd w:val="clear" w:color="auto" w:fill="F2F3F4"/>
+      </w:pPr>
+      <w:r>
+        <w:rPr>
+          <w:rFonts w:ascii="Courier New" w:hAnsi="Courier New"/>
+          <w:b w:val="0"/>
+          <w:color w:val="1E5A96"/>
+          <w:sz w:val="18"/>
+        </w:rPr>
+        <w:t>https://github.com/channian/BudgetAgent</w:t>
+      </w:r>
+    </w:p>
+    <w:p/>
+    <w:p>
+      <w:r>
+        <w:rPr>
+          <w:rFonts w:ascii="Microsoft JhengHei" w:hAnsi="Microsoft JhengHei" w:eastAsia="Microsoft JhengHei"/>
+          <w:b/>
+          <w:sz w:val="21"/>
+        </w:rPr>
+        <w:t>開發分支：</w:t>
+      </w:r>
+    </w:p>
+    <w:p>
+      <w:pPr>
+        <w:ind w:left="576"/>
+        <w:shd w:val="clear" w:color="auto" w:fill="F2F3F4"/>
+      </w:pPr>
+      <w:r>
+        <w:rPr>
+          <w:rFonts w:ascii="Courier New" w:hAnsi="Courier New"/>
+          <w:b w:val="0"/>
+          <w:color w:val="1E5A96"/>
+          <w:sz w:val="18"/>
+        </w:rPr>
+        <w:t>claude/elegant-dijkstra-fxlPR</w:t>
+      </w:r>
+    </w:p>
+    <w:p/>
+    <w:p>
+      <w:r>
+        <w:rPr>
+          <w:rFonts w:ascii="Microsoft JhengHei" w:hAnsi="Microsoft JhengHei" w:eastAsia="Microsoft JhengHei"/>
+          <w:b w:val="0"/>
+          <w:sz w:val="21"/>
+        </w:rPr>
+        <w:t>Clone 專案（首次）：</w:t>
+      </w:r>
+    </w:p>
+    <w:p>
+      <w:pPr>
+        <w:ind w:left="576"/>
+        <w:shd w:val="clear" w:color="auto" w:fill="F2F3F4"/>
+      </w:pPr>
+      <w:r>
+        <w:rPr>
+          <w:rFonts w:ascii="Courier New" w:hAnsi="Courier New"/>
+          <w:b w:val="0"/>
+          <w:color w:val="1E5A96"/>
+          <w:sz w:val="18"/>
+        </w:rPr>
+        <w:t>git clone https://github.com/channian/BudgetAgent.git</w:t>
+      </w:r>
+    </w:p>
+    <w:p>
+      <w:pPr>
+        <w:ind w:left="576"/>
+        <w:shd w:val="clear" w:color="auto" w:fill="F2F3F4"/>
+      </w:pPr>
+      <w:r>
+        <w:rPr>
+          <w:rFonts w:ascii="Courier New" w:hAnsi="Courier New"/>
+          <w:b w:val="0"/>
+          <w:color w:val="1E5A96"/>
+          <w:sz w:val="18"/>
+        </w:rPr>
+        <w:t>cd BudgetAgent</w:t>
+      </w:r>
+    </w:p>
+    <w:p>
+      <w:pPr>
+        <w:ind w:left="576"/>
+        <w:shd w:val="clear" w:color="auto" w:fill="F2F3F4"/>
+      </w:pPr>
+      <w:r>
+        <w:rPr>
+          <w:rFonts w:ascii="Courier New" w:hAnsi="Courier New"/>
+          <w:b w:val="0"/>
+          <w:color w:val="1E5A96"/>
+          <w:sz w:val="18"/>
+        </w:rPr>
+        <w:t>git checkout claude/elegant-dijkstra-fxlPR</w:t>
+      </w:r>
+    </w:p>
+    <w:p/>
+    <w:p>
+      <w:r>
+        <w:rPr>
+          <w:rFonts w:ascii="Microsoft JhengHei" w:hAnsi="Microsoft JhengHei" w:eastAsia="Microsoft JhengHei"/>
+          <w:b w:val="0"/>
+          <w:sz w:val="21"/>
+        </w:rPr>
+        <w:t>更新至最新代碼（後續）：</w:t>
       </w:r>
     </w:p>
     <w:p>
@@ -2473,6 +2591,17 @@
         <w:t>git pull origin claude/elegant-dijkstra-fxlPR</w:t>
       </w:r>
     </w:p>
+    <w:p/>
+    <w:p>
+      <w:r>
+        <w:rPr>
+          <w:rFonts w:ascii="Microsoft JhengHei" w:hAnsi="Microsoft JhengHei" w:eastAsia="Microsoft JhengHei"/>
+          <w:b w:val="0"/>
+          <w:sz w:val="21"/>
+        </w:rPr>
+        <w:t>推送修改：</w:t>
+      </w:r>
+    </w:p>
     <w:p>
       <w:pPr>
         <w:ind w:left="576"/>
@@ -2485,7 +2614,48 @@
           <w:color w:val="1E5A96"/>
           <w:sz w:val="18"/>
         </w:rPr>
-        <w:t>cd backend &amp;&amp; python app.py</w:t>
+        <w:t>git add &lt;changed_files&gt;</w:t>
+      </w:r>
+    </w:p>
+    <w:p>
+      <w:pPr>
+        <w:ind w:left="576"/>
+        <w:shd w:val="clear" w:color="auto" w:fill="F2F3F4"/>
+      </w:pPr>
+      <w:r>
+        <w:rPr>
+          <w:rFonts w:ascii="Courier New" w:hAnsi="Courier New"/>
+          <w:b w:val="0"/>
+          <w:color w:val="1E5A96"/>
+          <w:sz w:val="18"/>
+        </w:rPr>
+        <w:t>git commit -m "描述本次修改"</w:t>
+      </w:r>
+    </w:p>
+    <w:p>
+      <w:pPr>
+        <w:ind w:left="576"/>
+        <w:shd w:val="clear" w:color="auto" w:fill="F2F3F4"/>
+      </w:pPr>
+      <w:r>
+        <w:rPr>
+          <w:rFonts w:ascii="Courier New" w:hAnsi="Courier New"/>
+          <w:b w:val="0"/>
+          <w:color w:val="1E5A96"/>
+          <w:sz w:val="18"/>
+        </w:rPr>
+        <w:t>git push -u origin claude/elegant-dijkstra-fxlPR</w:t>
+      </w:r>
+    </w:p>
+    <w:p/>
+    <w:p>
+      <w:r>
+        <w:rPr>
+          <w:rFonts w:ascii="Microsoft JhengHei" w:hAnsi="Microsoft JhengHei" w:eastAsia="Microsoft JhengHei"/>
+          <w:b/>
+          <w:sz w:val="21"/>
+        </w:rPr>
+        <w:t>注意：所有改動只推送到 claude/elegant-dijkstra-fxlPR，不要推送到 main / master。</w:t>
       </w:r>
     </w:p>
     <w:p/>

</xml_diff>